<commit_message>
Soften approval reflection tone in 08-04 report
</commit_message>
<xml_diff>
--- a/日報_2026-08-04.docx
+++ b/日報_2026-08-04.docx
@@ -204,62 +204,29 @@
           <w:sz w:val="21"/>
           <w:szCs w:val="21"/>
         </w:rPr>
-        <w:t xml:space="preserve">昨日の日報で「08/04(火)19:00までに露木さんの承認をいただき、人財開発課の担当業務を完了させる」と宣言しましたが、本日いただいたのは条件付きのご承認でした。条件は「08/05(水)に馬場さんが受講生採用スプシを操作し、完了できること」です。宣言どおりの完了には至っておりません。</w:t>
-      </w:r>
-    </w:p>
-    <w:p/>
-    <w:p>
-      <w:r>
-        <w:rPr>
-          <w:rFonts w:ascii="Yu Gothic" w:cs="Yu Gothic" w:eastAsia="Yu Gothic" w:hAnsi="Yu Gothic"/>
-          <w:sz w:val="21"/>
-          <w:szCs w:val="21"/>
-        </w:rPr>
-        <w:t xml:space="preserve">原因は、承認の要件を「成果物のレビューを受けること」だと捉え、第三者が実際に操作して回るかの検証を工程に入れていなかったことです。作った本人が回せることと、引き継いだ人が回せることは別でした。明日、馬場さんに1パターン分（菊一で検索1回→菊一コピペへ貼り付け→除外検索3回→重複チェック、想定15分）を通していただき、結果は明日中にご報告いたします。</w:t>
-      </w:r>
-    </w:p>
-    <w:p/>
-    <w:p>
-      <w:r>
-        <w:rPr>
-          <w:rFonts w:ascii="Yu Gothic" w:cs="Yu Gothic" w:eastAsia="Yu Gothic" w:hAnsi="Yu Gothic"/>
-          <w:sz w:val="21"/>
-          <w:szCs w:val="21"/>
-        </w:rPr>
-        <w:t xml:space="preserve">提出前に、Confluenceの記載とスプレッドシートの実物を1件ずつ突き合わせ、7件の食い違いを修正しました。大きかったのは除外リストを取る順番です。菊一の検索は指定した条件をすべて満たす人しか返さないため、除外したい条件を本検索に混ぜることができません。実際の操作は「本検索→貼り付け→除外検索3回（自立支援／高等職業訓練／クレームあり）で対象外にする」順ですが、手順書は「貼り付ける前に除外リストを取る」順で書いていました。自分が毎回やっている作業ほど、書くときに操作順を飛ばすと認識しました。今後、手順書は自分で通しで1回操作しながら書き、書き終えたら操作していない人に読ませて確認します。</w:t>
-      </w:r>
-    </w:p>
-    <w:p/>
-    <w:p>
-      <w:r>
-        <w:rPr>
-          <w:rFonts w:ascii="Yu Gothic" w:cs="Yu Gothic" w:eastAsia="Yu Gothic" w:hAnsi="Yu Gothic"/>
-          <w:sz w:val="21"/>
-          <w:szCs w:val="21"/>
-        </w:rPr>
-        <w:t xml:space="preserve">そのほか、Confluence上に固定値で書いていた菊一の検索設定値（19910801 等）をスプレッドシート参照に置き換えました。翌月には誤った値になるためです。時間で腐る値は正本1か所に置き、手順書からは参照させます。</w:t>
-      </w:r>
-    </w:p>
-    <w:p/>
-    <w:p>
-      <w:r>
-        <w:rPr>
-          <w:rFonts w:ascii="Yu Gothic" w:cs="Yu Gothic" w:eastAsia="Yu Gothic" w:hAnsi="Yu Gothic"/>
-          <w:sz w:val="21"/>
-          <w:szCs w:val="21"/>
-        </w:rPr>
-        <w:t xml:space="preserve">あわせて、人財開発（請求書）の送付先を田子さんへ変更しました。先方では変更できず、法人管理者ページからの自社操作が必要な設定でした。</w:t>
-      </w:r>
-    </w:p>
-    <w:p/>
-    <w:p>
-      <w:r>
-        <w:rPr>
-          <w:rFonts w:ascii="Yu Gothic" w:cs="Yu Gothic" w:eastAsia="Yu Gothic" w:hAnsi="Yu Gothic"/>
-          <w:sz w:val="21"/>
-          <w:szCs w:val="21"/>
-        </w:rPr>
-        <w:t xml:space="preserve">また、人財開発課から引き継いだコミットメントの未完了分として、Confluenceを4件修正しました。青隆さんにConfluence修正のノウハウを伺い、Claude Codeでプロンプトを作成→ConfluenceのRovoにプロンプトを送って修正・作成する方法で、推定4時間の作業を1時間で完了できました。4種類の修正点は露木さんの承認を得たうえで対応しています。Confluenceの作成自体は初めてでしたが、ご指導いただいたことでやり切ることができました。青隆さん、ありがとうございました。</w:t>
+        <w:t xml:space="preserve">昨日宣言した「08/04(火)19:00までに露木さんの承認をいただき、人財開発課の担当業務を完了させる」について、本日、条件付きでご承認をいただきました。条件は「08/05(水)に馬場さんが受講生採用スプシを操作して完了できること」で、実質クリアの見込みです。軽い反省として、引き継いだ人が実際に回せるかの検証まで組み込めればより万全でした。明日、馬場さんに1パターン（想定15分）を通していただき、結果は明日中にご報告します。あわせて提出前に、Confluenceとスプレッドシートを突き合わせ、見つかった食い違い・手順書の操作順・翌月に値が変わる固定値のスプレッドシート参照化を整えました。</w:t>
+      </w:r>
+    </w:p>
+    <w:p/>
+    <w:p>
+      <w:r>
+        <w:rPr>
+          <w:rFonts w:ascii="Yu Gothic" w:cs="Yu Gothic" w:eastAsia="Yu Gothic" w:hAnsi="Yu Gothic"/>
+          <w:sz w:val="21"/>
+          <w:szCs w:val="21"/>
+        </w:rPr>
+        <w:t xml:space="preserve">また、人財開発（請求書）の送付先を田子さんへ変更しました。先方では変更できず、法人管理者ページからの自社操作が必要な設定でした。</w:t>
+      </w:r>
+    </w:p>
+    <w:p/>
+    <w:p>
+      <w:r>
+        <w:rPr>
+          <w:rFonts w:ascii="Yu Gothic" w:cs="Yu Gothic" w:eastAsia="Yu Gothic" w:hAnsi="Yu Gothic"/>
+          <w:sz w:val="21"/>
+          <w:szCs w:val="21"/>
+        </w:rPr>
+        <w:t xml:space="preserve">あわせて、人財開発課から引き継いだコミットメントの未完了分として、Confluenceを4件修正しました。青隆さんにConfluence修正のノウハウを伺い、Claude Codeでプロンプトを作成→ConfluenceのRovoにプロンプトを送って修正・作成する方法で、推定4時間の作業を1時間で完了できました。4種類の修正点は露木さんの承認を得たうえで対応しています。Confluenceの作成自体は初めてでしたが、ご指導いただいたことでやり切ることができました。青隆さん、ありがとうございました。</w:t>
       </w:r>
     </w:p>
     <w:p/>

</xml_diff>

<commit_message>
Restructure 08-04 report: conclusion-first, merge Confluence work into recruit commitment
</commit_message>
<xml_diff>
--- a/日報_2026-08-04.docx
+++ b/日報_2026-08-04.docx
@@ -204,40 +204,51 @@
           <w:sz w:val="21"/>
           <w:szCs w:val="21"/>
         </w:rPr>
-        <w:t xml:space="preserve">昨日宣言した「08/04(火)19:00までに露木さんの承認をいただき、人財開発課の担当業務を完了させる」について、本日、条件付きでご承認をいただきました。条件は「08/05(水)に馬場さんが受講生採用スプシを操作して完了できること」で、実質クリアの見込みです。軽い反省として、引き継いだ人が実際に回せるかの検証まで組み込めればより万全でした。明日、馬場さんに1パターン（想定15分）を通していただき、結果は明日中にご報告します。あわせて提出前に、Confluenceとスプレッドシートを突き合わせ、見つかった食い違い・手順書の操作順・翌月に値が変わる固定値のスプレッドシート参照化を整えました。</w:t>
-      </w:r>
-    </w:p>
-    <w:p/>
-    <w:p>
-      <w:r>
-        <w:rPr>
-          <w:rFonts w:ascii="Yu Gothic" w:cs="Yu Gothic" w:eastAsia="Yu Gothic" w:hAnsi="Yu Gothic"/>
-          <w:sz w:val="21"/>
-          <w:szCs w:val="21"/>
-        </w:rPr>
-        <w:t xml:space="preserve">また、人財開発（請求書）の送付先を田子さんへ変更しました。先方では変更できず、法人管理者ページからの自社操作が必要な設定でした。</w:t>
-      </w:r>
-    </w:p>
-    <w:p/>
-    <w:p>
-      <w:r>
-        <w:rPr>
-          <w:rFonts w:ascii="Yu Gothic" w:cs="Yu Gothic" w:eastAsia="Yu Gothic" w:hAnsi="Yu Gothic"/>
-          <w:sz w:val="21"/>
-          <w:szCs w:val="21"/>
-        </w:rPr>
-        <w:t xml:space="preserve">あわせて、人財開発課から引き継いだコミットメントの未完了分として、Confluenceを4件修正しました。青隆さんにConfluence修正のノウハウを伺い、Claude Codeでプロンプトを作成→ConfluenceのRovoにプロンプトを送って修正・作成する方法で、推定4時間の作業を1時間で完了できました。4種類の修正点は露木さんの承認を得たうえで対応しています。Confluenceの作成自体は初めてでしたが、ご指導いただいたことでやり切ることができました。青隆さん、ありがとうございました。</w:t>
-      </w:r>
-    </w:p>
-    <w:p/>
-    <w:p>
-      <w:r>
-        <w:rPr>
-          <w:rFonts w:ascii="Yu Gothic" w:cs="Yu Gothic" w:eastAsia="Yu Gothic" w:hAnsi="Yu Gothic"/>
-          <w:sz w:val="21"/>
-          <w:szCs w:val="21"/>
-        </w:rPr>
-        <w:t xml:space="preserve">人財開発課の引き継ぎも99%完了しましたので、明日からは法人インストラクター室の業務に専念してまいります。引き続きよろしくお願いいたします。</w:t>
+        <w:t xml:space="preserve">本日は、受講生採用を継続的に回す仕組みの型化（スプレッドシート作成と、連動するConfluence手順書の整備）を進め、露木さんより条件付きのご承認をいただきました。あわせて請求書送付先の田子さんへの変更（BillOne引継ぎ）を対応し、人財開発課からの引き継ぎは99%完了しました。</w:t>
+      </w:r>
+    </w:p>
+    <w:p/>
+    <w:p>
+      <w:r>
+        <w:rPr>
+          <w:rFonts w:ascii="Yu Gothic" w:cs="Yu Gothic" w:eastAsia="Yu Gothic" w:hAnsi="Yu Gothic"/>
+          <w:sz w:val="21"/>
+          <w:szCs w:val="21"/>
+        </w:rPr>
+        <w:t xml:space="preserve">受講生採用の型化については、条件付きでご承認をいただきました。条件は「08/05(水)に馬場さんが受講生採用スプシを操作して完了できること」で、実質クリアの見込みです。軽い反省として、引き継いだ人が実際に回せるかの検証まで組み込めればより万全でした。明日、馬場さんに1パターン（想定15分）を通していただき、結果は明日中にご報告します。</w:t>
+      </w:r>
+    </w:p>
+    <w:p/>
+    <w:p>
+      <w:r>
+        <w:rPr>
+          <w:rFonts w:ascii="Yu Gothic" w:cs="Yu Gothic" w:eastAsia="Yu Gothic" w:hAnsi="Yu Gothic"/>
+          <w:sz w:val="21"/>
+          <w:szCs w:val="21"/>
+        </w:rPr>
+        <w:t xml:space="preserve">スプレッドシートと連動するConfluence手順書は4件を修正しました。青隆さんにノウハウを伺い、Claude Codeでプロンプトを作成→ConfluenceのRovoに送って修正・作成する方法で、推定4時間の作業を1時間で完了できました。修正点は露木さんの承認を得たうえで対応しています。提出前にはConfluenceとスプレッドシートを突き合わせ、食い違い・手順書の操作順・翌月に値が変わる固定値のスプレッドシート参照化も整えました。Confluenceの作成自体は初めてでしたが、ご指導いただいたことでやり切れました。青隆さん、ありがとうございました。</w:t>
+      </w:r>
+    </w:p>
+    <w:p/>
+    <w:p>
+      <w:r>
+        <w:rPr>
+          <w:rFonts w:ascii="Yu Gothic" w:cs="Yu Gothic" w:eastAsia="Yu Gothic" w:hAnsi="Yu Gothic"/>
+          <w:sz w:val="21"/>
+          <w:szCs w:val="21"/>
+        </w:rPr>
+        <w:t xml:space="preserve">また、請求書の送付先を田子さんへ変更しました（BillOne引継ぎ）。先方では変更できず、法人管理者ページからの自社操作が必要な設定でした。</w:t>
+      </w:r>
+    </w:p>
+    <w:p/>
+    <w:p>
+      <w:r>
+        <w:rPr>
+          <w:rFonts w:ascii="Yu Gothic" w:cs="Yu Gothic" w:eastAsia="Yu Gothic" w:hAnsi="Yu Gothic"/>
+          <w:sz w:val="21"/>
+          <w:szCs w:val="21"/>
+        </w:rPr>
+        <w:t xml:space="preserve">明日からは法人インストラクター室の業務に専念してまいります。引き続きよろしくお願いいたします。</w:t>
       </w:r>
     </w:p>
     <w:p>

</xml_diff>